<commit_message>
templaturi adaugate si documentatia
sa adugat scrispturi de initializare a bazei de date si documentatia de instalare
</commit_message>
<xml_diff>
--- a/Documentatia Programari Examene.docx
+++ b/Documentatia Programari Examene.docx
@@ -3073,13 +3073,7 @@
         <w:rPr>
           <w:lang w:val="ro-RO"/>
         </w:rPr>
-        <w:t>npx create-react-app</w:t>
-      </w:r>
-      <w:r>
-        <w:rPr>
-          <w:lang w:val="ro-RO"/>
-        </w:rPr>
-        <w:t xml:space="preserve"> frontend</w:t>
+        <w:t>npx create-react-app frontend</w:t>
       </w:r>
     </w:p>
     <w:p>
@@ -3173,6 +3167,735 @@
         </w:rPr>
         <w:t>npm start</w:t>
       </w:r>
+    </w:p>
+    <w:p>
+      <w:pPr>
+        <w:pStyle w:val="Heading1"/>
+        <w:rPr>
+          <w:lang w:val="ro-RO"/>
+        </w:rPr>
+      </w:pPr>
+      <w:r>
+        <w:rPr>
+          <w:lang w:val="ro-RO"/>
+        </w:rPr>
+        <w:t>Inițializare Baza de date</w:t>
+      </w:r>
+    </w:p>
+    <w:p>
+      <w:pPr>
+        <w:rPr>
+          <w:lang w:val="ro-RO"/>
+        </w:rPr>
+      </w:pPr>
+      <w:r>
+        <w:rPr>
+          <w:lang w:val="ro-RO"/>
+        </w:rPr>
+        <w:t>1.</w:t>
+      </w:r>
+      <w:r>
+        <w:rPr>
+          <w:lang w:val="ro-RO"/>
+        </w:rPr>
+        <w:t xml:space="preserve"> </w:t>
+      </w:r>
+      <w:r>
+        <w:rPr>
+          <w:lang w:val="ro-RO"/>
+        </w:rPr>
+        <w:t>T</w:t>
+      </w:r>
+      <w:r>
+        <w:rPr>
+          <w:lang w:val="ro-RO"/>
+        </w:rPr>
+        <w:t xml:space="preserve">rebuie de executat fișierul </w:t>
+      </w:r>
+      <w:r>
+        <w:rPr>
+          <w:b/>
+          <w:bCs/>
+          <w:lang w:val="ro-RO"/>
+        </w:rPr>
+        <w:t>create_tabels.py</w:t>
+      </w:r>
+      <w:r>
+        <w:rPr>
+          <w:lang w:val="ro-RO"/>
+        </w:rPr>
+        <w:t xml:space="preserve"> care genereaza tabelele goale necesare în baza de date.</w:t>
+      </w:r>
+    </w:p>
+    <w:p>
+      <w:pPr>
+        <w:ind w:firstLine="708"/>
+        <w:rPr>
+          <w:b/>
+          <w:bCs/>
+          <w:i/>
+          <w:iCs/>
+          <w:lang w:val="ro-RO"/>
+        </w:rPr>
+      </w:pPr>
+      <w:r>
+        <w:rPr>
+          <w:b/>
+          <w:bCs/>
+          <w:i/>
+          <w:iCs/>
+          <w:lang w:val="ro-RO"/>
+        </w:rPr>
+        <w:t>py create_tabels.py</w:t>
+      </w:r>
+    </w:p>
+    <w:p>
+      <w:pPr>
+        <w:rPr>
+          <w:lang w:val="ro-RO"/>
+        </w:rPr>
+      </w:pPr>
+      <w:r>
+        <w:rPr>
+          <w:lang w:val="ro-RO"/>
+        </w:rPr>
+        <w:t xml:space="preserve">2. se executa </w:t>
+      </w:r>
+      <w:r>
+        <w:rPr>
+          <w:lang w:val="ro-RO"/>
+        </w:rPr>
+        <w:t>4</w:t>
+      </w:r>
+      <w:r>
+        <w:rPr>
+          <w:lang w:val="ro-RO"/>
+        </w:rPr>
+        <w:t xml:space="preserve"> scripturi</w:t>
+      </w:r>
+      <w:r>
+        <w:rPr>
+          <w:lang w:val="ro-RO"/>
+        </w:rPr>
+        <w:t xml:space="preserve"> din folderul </w:t>
+      </w:r>
+      <w:r>
+        <w:rPr>
+          <w:i/>
+          <w:iCs/>
+          <w:lang w:val="ro-RO"/>
+        </w:rPr>
+        <w:t>exam_app</w:t>
+      </w:r>
+      <w:r>
+        <w:rPr>
+          <w:lang w:val="ro-RO"/>
+        </w:rPr>
+        <w:t xml:space="preserve"> de descărcare Săli</w:t>
+      </w:r>
+      <w:r>
+        <w:rPr>
+          <w:lang w:val="ro-RO"/>
+        </w:rPr>
+        <w:t>,</w:t>
+      </w:r>
+      <w:r>
+        <w:rPr>
+          <w:lang w:val="ro-RO"/>
+        </w:rPr>
+        <w:t xml:space="preserve"> subgrupe</w:t>
+      </w:r>
+      <w:r>
+        <w:rPr>
+          <w:lang w:val="ro-RO"/>
+        </w:rPr>
+        <w:t>, cadre</w:t>
+      </w:r>
+      <w:r>
+        <w:rPr>
+          <w:lang w:val="ro-RO"/>
+        </w:rPr>
+        <w:t xml:space="preserve"> și facultăți</w:t>
+      </w:r>
+      <w:r>
+        <w:rPr>
+          <w:lang w:val="ro-RO"/>
+        </w:rPr>
+        <w:t>.</w:t>
+      </w:r>
+    </w:p>
+    <w:p>
+      <w:pPr>
+        <w:pStyle w:val="ListParagraph"/>
+        <w:numPr>
+          <w:ilvl w:val="0"/>
+          <w:numId w:val="12"/>
+        </w:numPr>
+        <w:rPr>
+          <w:lang w:val="ro-RO"/>
+        </w:rPr>
+      </w:pPr>
+      <w:r>
+        <w:rPr>
+          <w:b/>
+          <w:bCs/>
+          <w:i/>
+          <w:iCs/>
+          <w:lang w:val="ro-RO"/>
+        </w:rPr>
+        <w:t>py save_sali</w:t>
+      </w:r>
+      <w:r>
+        <w:rPr>
+          <w:b/>
+          <w:bCs/>
+          <w:i/>
+          <w:iCs/>
+          <w:lang w:val="ro-RO"/>
+        </w:rPr>
+        <w:t>.py</w:t>
+      </w:r>
+      <w:r>
+        <w:rPr>
+          <w:lang w:val="ro-RO"/>
+        </w:rPr>
+        <w:t xml:space="preserve"> </w:t>
+      </w:r>
+    </w:p>
+    <w:p>
+      <w:pPr>
+        <w:pStyle w:val="ListParagraph"/>
+        <w:numPr>
+          <w:ilvl w:val="0"/>
+          <w:numId w:val="12"/>
+        </w:numPr>
+        <w:rPr>
+          <w:b/>
+          <w:bCs/>
+          <w:i/>
+          <w:iCs/>
+          <w:lang w:val="ro-RO"/>
+        </w:rPr>
+      </w:pPr>
+      <w:r>
+        <w:rPr>
+          <w:b/>
+          <w:bCs/>
+          <w:i/>
+          <w:iCs/>
+          <w:lang w:val="ro-RO"/>
+        </w:rPr>
+        <w:t>py save_subgrupe</w:t>
+      </w:r>
+      <w:r>
+        <w:rPr>
+          <w:b/>
+          <w:bCs/>
+          <w:i/>
+          <w:iCs/>
+          <w:lang w:val="ro-RO"/>
+        </w:rPr>
+        <w:t>.py</w:t>
+      </w:r>
+    </w:p>
+    <w:p>
+      <w:pPr>
+        <w:pStyle w:val="ListParagraph"/>
+        <w:numPr>
+          <w:ilvl w:val="0"/>
+          <w:numId w:val="12"/>
+        </w:numPr>
+        <w:rPr>
+          <w:b/>
+          <w:bCs/>
+          <w:i/>
+          <w:iCs/>
+          <w:lang w:val="ro-RO"/>
+        </w:rPr>
+      </w:pPr>
+      <w:r>
+        <w:rPr>
+          <w:b/>
+          <w:bCs/>
+          <w:i/>
+          <w:iCs/>
+          <w:lang w:val="ro-RO"/>
+        </w:rPr>
+        <w:t>py save_cadre.py</w:t>
+      </w:r>
+    </w:p>
+    <w:p>
+      <w:pPr>
+        <w:pStyle w:val="ListParagraph"/>
+        <w:numPr>
+          <w:ilvl w:val="0"/>
+          <w:numId w:val="12"/>
+        </w:numPr>
+        <w:rPr>
+          <w:b/>
+          <w:bCs/>
+          <w:i/>
+          <w:iCs/>
+          <w:lang w:val="ro-RO"/>
+        </w:rPr>
+      </w:pPr>
+      <w:r>
+        <w:rPr>
+          <w:b/>
+          <w:bCs/>
+          <w:i/>
+          <w:iCs/>
+          <w:lang w:val="ro-RO"/>
+        </w:rPr>
+        <w:t>py save_facultati.py</w:t>
+      </w:r>
+    </w:p>
+    <w:p>
+      <w:pPr>
+        <w:rPr>
+          <w:lang w:val="ro-RO"/>
+        </w:rPr>
+      </w:pPr>
+      <w:r>
+        <w:rPr>
+          <w:lang w:val="ro-RO"/>
+        </w:rPr>
+        <w:t>3.</w:t>
+      </w:r>
+      <w:r>
+        <w:rPr>
+          <w:lang w:val="ro-RO"/>
+        </w:rPr>
+        <w:t xml:space="preserve">Se va </w:t>
+      </w:r>
+      <w:r>
+        <w:rPr>
+          <w:lang w:val="ro-RO"/>
+        </w:rPr>
+        <w:t>completa</w:t>
+      </w:r>
+      <w:r>
+        <w:rPr>
+          <w:lang w:val="ro-RO"/>
+        </w:rPr>
+        <w:t xml:space="preserve"> fișierul template admin_template.xlsx</w:t>
+      </w:r>
+      <w:r>
+        <w:rPr>
+          <w:lang w:val="ro-RO"/>
+        </w:rPr>
+        <w:t xml:space="preserve"> și se va pune în proiect în folderul exam_app/vizualizare_date.</w:t>
+      </w:r>
+    </w:p>
+    <w:p>
+      <w:pPr>
+        <w:rPr>
+          <w:lang w:val="ro-RO"/>
+        </w:rPr>
+      </w:pPr>
+      <w:r>
+        <w:rPr>
+          <w:lang w:val="ro-RO"/>
+        </w:rPr>
+        <w:t xml:space="preserve">4. Se va completa fișierul secretariat_template.xlsx și se va pune </w:t>
+      </w:r>
+      <w:r>
+        <w:rPr>
+          <w:lang w:val="ro-RO"/>
+        </w:rPr>
+        <w:t>în proiect în folderul exam_app/vizualizare_date.</w:t>
+      </w:r>
+    </w:p>
+    <w:p>
+      <w:pPr>
+        <w:rPr>
+          <w:lang w:val="en-US"/>
+        </w:rPr>
+      </w:pPr>
+      <w:r>
+        <w:rPr>
+          <w:lang w:val="ro-RO"/>
+        </w:rPr>
+        <w:lastRenderedPageBreak/>
+        <w:t xml:space="preserve">5.Se va executa scriptul convert.py prin comanda </w:t>
+      </w:r>
+      <w:r>
+        <w:rPr>
+          <w:b/>
+          <w:bCs/>
+          <w:i/>
+          <w:iCs/>
+          <w:lang w:val="ro-RO"/>
+        </w:rPr>
+        <w:t>py convert.py</w:t>
+      </w:r>
+      <w:r>
+        <w:rPr>
+          <w:lang w:val="ro-RO"/>
+        </w:rPr>
+        <w:t xml:space="preserve"> , această comandă va converti fișierele excel (</w:t>
+      </w:r>
+      <w:r>
+        <w:rPr>
+          <w:lang w:val="en-US"/>
+        </w:rPr>
+        <w:t>.xlsx) ]n fi;iere CSV.</w:t>
+      </w:r>
+    </w:p>
+    <w:p>
+      <w:pPr>
+        <w:rPr>
+          <w:lang w:val="ro-RO"/>
+        </w:rPr>
+      </w:pPr>
+      <w:r>
+        <w:rPr>
+          <w:lang w:val="en-US"/>
+        </w:rPr>
+        <w:t>6.</w:t>
+      </w:r>
+      <w:r>
+        <w:rPr>
+          <w:lang w:val="en-US"/>
+        </w:rPr>
+        <w:t>Se va executa scriptul import.py prin comanda py import.py, aceast</w:t>
+      </w:r>
+      <w:r>
+        <w:rPr>
+          <w:lang w:val="ro-RO"/>
+        </w:rPr>
+        <w:t>ă comanda va importa fișierele CSV în baza de date.</w:t>
+      </w:r>
+    </w:p>
+    <w:p>
+      <w:pPr>
+        <w:rPr>
+          <w:lang w:val="en-US"/>
+        </w:rPr>
+      </w:pPr>
+      <w:r>
+        <w:rPr>
+          <w:lang w:val="ro-RO"/>
+        </w:rPr>
+        <w:t>7.Se pornește aplicația și obligatoriu trebuie ca Secretariatul să intre pe cont și să facă urmatoarele</w:t>
+      </w:r>
+      <w:r>
+        <w:rPr>
+          <w:lang w:val="en-US"/>
+        </w:rPr>
+        <w:t>:</w:t>
+      </w:r>
+    </w:p>
+    <w:p>
+      <w:pPr>
+        <w:pStyle w:val="ListParagraph"/>
+        <w:numPr>
+          <w:ilvl w:val="0"/>
+          <w:numId w:val="13"/>
+        </w:numPr>
+        <w:rPr>
+          <w:lang w:val="ro-RO"/>
+        </w:rPr>
+      </w:pPr>
+      <w:r>
+        <w:rPr>
+          <w:lang w:val="en-US"/>
+        </w:rPr>
+        <w:t>Se logheaz</w:t>
+      </w:r>
+      <w:r>
+        <w:rPr>
+          <w:lang w:val="ro-RO"/>
+        </w:rPr>
+        <w:t>ă prin cont google.</w:t>
+      </w:r>
+    </w:p>
+    <w:p>
+      <w:pPr>
+        <w:pStyle w:val="ListParagraph"/>
+        <w:numPr>
+          <w:ilvl w:val="0"/>
+          <w:numId w:val="13"/>
+        </w:numPr>
+        <w:rPr>
+          <w:lang w:val="ro-RO"/>
+        </w:rPr>
+      </w:pPr>
+      <w:r>
+        <w:rPr>
+          <w:lang w:val="ro-RO"/>
+        </w:rPr>
+        <w:t xml:space="preserve">Accesează </w:t>
+      </w:r>
+      <w:r>
+        <w:rPr>
+          <w:lang w:val="ro-RO"/>
+        </w:rPr>
+        <w:t xml:space="preserve">Gestionare Examene, apoi </w:t>
+      </w:r>
+      <w:r>
+        <w:rPr>
+          <w:lang w:val="ro-RO"/>
+        </w:rPr>
+        <w:t>Configurare Perioade Examene și stabilește inceputul și sfârșitul perioadei de examen.</w:t>
+      </w:r>
+      <w:r>
+        <w:rPr>
+          <w:lang w:val="ro-RO"/>
+        </w:rPr>
+        <w:t>(</w:t>
+      </w:r>
+      <w:r>
+        <w:rPr>
+          <w:i/>
+          <w:iCs/>
+          <w:lang w:val="ro-RO"/>
+        </w:rPr>
+        <w:t>Fig 2.8,Fig2.9</w:t>
+      </w:r>
+      <w:r>
+        <w:rPr>
+          <w:lang w:val="ro-RO"/>
+        </w:rPr>
+        <w:t>)</w:t>
+      </w:r>
+    </w:p>
+    <w:p>
+      <w:pPr>
+        <w:pStyle w:val="ListParagraph"/>
+        <w:numPr>
+          <w:ilvl w:val="0"/>
+          <w:numId w:val="13"/>
+        </w:numPr>
+        <w:rPr>
+          <w:lang w:val="ro-RO"/>
+        </w:rPr>
+      </w:pPr>
+      <w:r>
+        <w:rPr>
+          <w:lang w:val="ro-RO"/>
+        </w:rPr>
+        <w:t>Accesează Gestionare Șefi de grupă, apoi</w:t>
+      </w:r>
+      <w:r>
+        <w:rPr>
+          <w:lang w:val="ro-RO"/>
+        </w:rPr>
+        <w:t xml:space="preserve"> încarcă fișierul sefgrupe.xlsx și apasă butonul Importă șefii de grupa. (templatul pentru completare șefii de grupă va fi </w:t>
+      </w:r>
+      <w:r>
+        <w:rPr>
+          <w:lang w:val="ro-RO"/>
+        </w:rPr>
+        <w:t>sefgrupe_template.xlsx</w:t>
+      </w:r>
+      <w:r>
+        <w:rPr>
+          <w:lang w:val="ro-RO"/>
+        </w:rPr>
+        <w:t>)</w:t>
+      </w:r>
+      <w:r>
+        <w:rPr>
+          <w:lang w:val="ro-RO"/>
+        </w:rPr>
+        <w:t>(</w:t>
+      </w:r>
+      <w:r>
+        <w:rPr>
+          <w:i/>
+          <w:iCs/>
+          <w:lang w:val="ro-RO"/>
+        </w:rPr>
+        <w:t>Fig 2.10</w:t>
+      </w:r>
+      <w:r>
+        <w:rPr>
+          <w:lang w:val="ro-RO"/>
+        </w:rPr>
+        <w:t>)</w:t>
+      </w:r>
+      <w:r>
+        <w:rPr>
+          <w:lang w:val="ro-RO"/>
+        </w:rPr>
+        <w:t xml:space="preserve">, sau accesează </w:t>
+      </w:r>
+      <w:r>
+        <w:rPr>
+          <w:lang w:val="ro-RO"/>
+        </w:rPr>
+        <w:t>Gestionare Șefi de grupă</w:t>
+      </w:r>
+      <w:r>
+        <w:rPr>
+          <w:lang w:val="ro-RO"/>
+        </w:rPr>
+        <w:t>, Editează șefi de grupă și adaugă șefii de grupă prin formularul de adăugare.</w:t>
+      </w:r>
+      <w:r>
+        <w:rPr>
+          <w:lang w:val="ro-RO"/>
+        </w:rPr>
+        <w:t>(</w:t>
+      </w:r>
+      <w:r>
+        <w:rPr>
+          <w:i/>
+          <w:iCs/>
+          <w:lang w:val="ro-RO"/>
+        </w:rPr>
+        <w:t>Fig 2.11</w:t>
+      </w:r>
+      <w:r>
+        <w:rPr>
+          <w:i/>
+          <w:iCs/>
+          <w:lang w:val="ro-RO"/>
+        </w:rPr>
+        <w:t>)</w:t>
+      </w:r>
+    </w:p>
+    <w:p>
+      <w:pPr>
+        <w:pStyle w:val="ListParagraph"/>
+        <w:numPr>
+          <w:ilvl w:val="0"/>
+          <w:numId w:val="13"/>
+        </w:numPr>
+        <w:rPr>
+          <w:lang w:val="ro-RO"/>
+        </w:rPr>
+      </w:pPr>
+      <w:r>
+        <w:rPr>
+          <w:lang w:val="ro-RO"/>
+        </w:rPr>
+        <w:t>Accesează Gestionare Discipline, și face exact ordinea aceasta a butoanelor,</w:t>
+      </w:r>
+    </w:p>
+    <w:p>
+      <w:pPr>
+        <w:pStyle w:val="ListParagraph"/>
+        <w:numPr>
+          <w:ilvl w:val="1"/>
+          <w:numId w:val="13"/>
+        </w:numPr>
+        <w:rPr>
+          <w:lang w:val="ro-RO"/>
+        </w:rPr>
+      </w:pPr>
+      <w:r>
+        <w:rPr>
+          <w:lang w:val="ro-RO"/>
+        </w:rPr>
+        <w:t xml:space="preserve"> </w:t>
+      </w:r>
+      <w:r>
+        <w:rPr>
+          <w:b/>
+          <w:bCs/>
+          <w:lang w:val="ro-RO"/>
+        </w:rPr>
+        <w:t>Genereaza Discipline</w:t>
+      </w:r>
+      <w:r>
+        <w:rPr>
+          <w:lang w:val="ro-RO"/>
+        </w:rPr>
+        <w:t xml:space="preserve"> și așteaptă mesajul de succes pentru generare,</w:t>
+      </w:r>
+    </w:p>
+    <w:p>
+      <w:pPr>
+        <w:pStyle w:val="ListParagraph"/>
+        <w:numPr>
+          <w:ilvl w:val="1"/>
+          <w:numId w:val="13"/>
+        </w:numPr>
+        <w:rPr>
+          <w:lang w:val="ro-RO"/>
+        </w:rPr>
+      </w:pPr>
+      <w:r>
+        <w:rPr>
+          <w:lang w:val="ro-RO"/>
+        </w:rPr>
+        <w:t xml:space="preserve"> </w:t>
+      </w:r>
+      <w:r>
+        <w:rPr>
+          <w:lang w:val="ro-RO"/>
+        </w:rPr>
+        <w:t>A</w:t>
+      </w:r>
+      <w:r>
+        <w:rPr>
+          <w:lang w:val="ro-RO"/>
+        </w:rPr>
+        <w:t xml:space="preserve">poi apasă </w:t>
+      </w:r>
+      <w:r>
+        <w:rPr>
+          <w:b/>
+          <w:bCs/>
+          <w:lang w:val="ro-RO"/>
+        </w:rPr>
+        <w:t>Importă Disciplinele</w:t>
+      </w:r>
+      <w:r>
+        <w:rPr>
+          <w:lang w:val="ro-RO"/>
+        </w:rPr>
+        <w:t>.</w:t>
+      </w:r>
+    </w:p>
+    <w:p>
+      <w:pPr>
+        <w:rPr>
+          <w:lang w:val="ro-RO"/>
+        </w:rPr>
+      </w:pPr>
+      <w:r>
+        <w:rPr>
+          <w:lang w:val="ro-RO"/>
+        </w:rPr>
+        <w:t>Baza de date a fost inițializată cu succes.</w:t>
+      </w:r>
+      <w:r>
+        <w:rPr>
+          <w:lang w:val="ro-RO"/>
+        </w:rPr>
+        <w:br/>
+      </w:r>
+    </w:p>
+    <w:p>
+      <w:pPr>
+        <w:rPr>
+          <w:lang w:val="ro-RO"/>
+        </w:rPr>
+      </w:pPr>
+    </w:p>
+    <w:p>
+      <w:pPr>
+        <w:rPr>
+          <w:lang w:val="ro-RO"/>
+        </w:rPr>
+      </w:pPr>
+    </w:p>
+    <w:p>
+      <w:pPr>
+        <w:rPr>
+          <w:lang w:val="ro-RO"/>
+        </w:rPr>
+      </w:pPr>
+    </w:p>
+    <w:p>
+      <w:pPr>
+        <w:rPr>
+          <w:lang w:val="ro-RO"/>
+        </w:rPr>
+      </w:pPr>
     </w:p>
     <w:p>
       <w:pPr>
@@ -4268,6 +4991,170 @@
     <w:p>
       <w:pPr>
         <w:rPr>
+          <w:i/>
+          <w:iCs/>
+          <w:lang w:val="en-US"/>
+        </w:rPr>
+      </w:pPr>
+      <w:r>
+        <w:rPr>
+          <w:i/>
+          <w:iCs/>
+          <w:noProof/>
+          <w:lang w:val="en-US"/>
+        </w:rPr>
+        <w:drawing>
+          <wp:inline distT="0" distB="0" distL="0" distR="0" wp14:anchorId="786504B9" wp14:editId="372F1F24">
+            <wp:extent cx="5940425" cy="2453005"/>
+            <wp:effectExtent l="0" t="0" r="3175" b="4445"/>
+            <wp:docPr id="487862608" name="Picture 1"/>
+            <wp:cNvGraphicFramePr>
+              <a:graphicFrameLocks xmlns:a="http://schemas.openxmlformats.org/drawingml/2006/main" noChangeAspect="1"/>
+            </wp:cNvGraphicFramePr>
+            <a:graphic xmlns:a="http://schemas.openxmlformats.org/drawingml/2006/main">
+              <a:graphicData uri="http://schemas.openxmlformats.org/drawingml/2006/picture">
+                <pic:pic xmlns:pic="http://schemas.openxmlformats.org/drawingml/2006/picture">
+                  <pic:nvPicPr>
+                    <pic:cNvPr id="487862608" name="Picture 487862608"/>
+                    <pic:cNvPicPr/>
+                  </pic:nvPicPr>
+                  <pic:blipFill>
+                    <a:blip r:embed="rId16">
+                      <a:extLst>
+                        <a:ext uri="{28A0092B-C50C-407E-A947-70E740481C1C}">
+                          <a14:useLocalDpi xmlns:a14="http://schemas.microsoft.com/office/drawing/2010/main" val="0"/>
+                        </a:ext>
+                      </a:extLst>
+                    </a:blip>
+                    <a:stretch>
+                      <a:fillRect/>
+                    </a:stretch>
+                  </pic:blipFill>
+                  <pic:spPr>
+                    <a:xfrm>
+                      <a:off x="0" y="0"/>
+                      <a:ext cx="5940425" cy="2453005"/>
+                    </a:xfrm>
+                    <a:prstGeom prst="rect">
+                      <a:avLst/>
+                    </a:prstGeom>
+                  </pic:spPr>
+                </pic:pic>
+              </a:graphicData>
+            </a:graphic>
+          </wp:inline>
+        </w:drawing>
+      </w:r>
+    </w:p>
+    <w:p>
+      <w:pPr>
+        <w:jc w:val="center"/>
+        <w:rPr>
+          <w:i/>
+          <w:iCs/>
+          <w:lang w:val="en-US"/>
+        </w:rPr>
+      </w:pPr>
+      <w:r>
+        <w:rPr>
+          <w:i/>
+          <w:iCs/>
+          <w:lang w:val="en-US"/>
+        </w:rPr>
+        <w:t>Fig 2.10</w:t>
+      </w:r>
+    </w:p>
+    <w:p>
+      <w:pPr>
+        <w:jc w:val="center"/>
+        <w:rPr>
+          <w:i/>
+          <w:iCs/>
+          <w:lang w:val="en-US"/>
+        </w:rPr>
+      </w:pPr>
+    </w:p>
+    <w:p>
+      <w:pPr>
+        <w:jc w:val="center"/>
+        <w:rPr>
+          <w:i/>
+          <w:iCs/>
+          <w:lang w:val="en-US"/>
+        </w:rPr>
+      </w:pPr>
+      <w:r>
+        <w:rPr>
+          <w:i/>
+          <w:iCs/>
+          <w:noProof/>
+          <w:lang w:val="en-US"/>
+        </w:rPr>
+        <w:lastRenderedPageBreak/>
+        <w:drawing>
+          <wp:inline distT="0" distB="0" distL="0" distR="0" wp14:anchorId="598F7208" wp14:editId="0F339779">
+            <wp:extent cx="5940425" cy="2167255"/>
+            <wp:effectExtent l="0" t="0" r="3175" b="4445"/>
+            <wp:docPr id="1437582788" name="Picture 2"/>
+            <wp:cNvGraphicFramePr>
+              <a:graphicFrameLocks xmlns:a="http://schemas.openxmlformats.org/drawingml/2006/main" noChangeAspect="1"/>
+            </wp:cNvGraphicFramePr>
+            <a:graphic xmlns:a="http://schemas.openxmlformats.org/drawingml/2006/main">
+              <a:graphicData uri="http://schemas.openxmlformats.org/drawingml/2006/picture">
+                <pic:pic xmlns:pic="http://schemas.openxmlformats.org/drawingml/2006/picture">
+                  <pic:nvPicPr>
+                    <pic:cNvPr id="1437582788" name="Picture 1437582788"/>
+                    <pic:cNvPicPr/>
+                  </pic:nvPicPr>
+                  <pic:blipFill>
+                    <a:blip r:embed="rId17">
+                      <a:extLst>
+                        <a:ext uri="{28A0092B-C50C-407E-A947-70E740481C1C}">
+                          <a14:useLocalDpi xmlns:a14="http://schemas.microsoft.com/office/drawing/2010/main" val="0"/>
+                        </a:ext>
+                      </a:extLst>
+                    </a:blip>
+                    <a:stretch>
+                      <a:fillRect/>
+                    </a:stretch>
+                  </pic:blipFill>
+                  <pic:spPr>
+                    <a:xfrm>
+                      <a:off x="0" y="0"/>
+                      <a:ext cx="5940425" cy="2167255"/>
+                    </a:xfrm>
+                    <a:prstGeom prst="rect">
+                      <a:avLst/>
+                    </a:prstGeom>
+                  </pic:spPr>
+                </pic:pic>
+              </a:graphicData>
+            </a:graphic>
+          </wp:inline>
+        </w:drawing>
+      </w:r>
+    </w:p>
+    <w:p>
+      <w:pPr>
+        <w:jc w:val="center"/>
+        <w:rPr>
+          <w:i/>
+          <w:iCs/>
+          <w:lang w:val="en-US"/>
+        </w:rPr>
+      </w:pPr>
+      <w:r>
+        <w:rPr>
+          <w:i/>
+          <w:iCs/>
+          <w:lang w:val="en-US"/>
+        </w:rPr>
+        <w:t>Fig 2.11</w:t>
+      </w:r>
+    </w:p>
+    <w:p>
+      <w:pPr>
+        <w:rPr>
           <w:rFonts w:cs="Times New Roman"/>
           <w:b/>
           <w:bCs/>
@@ -4284,13 +5171,7 @@
         <w:rPr>
           <w:lang w:val="en-US"/>
         </w:rPr>
-        <w:t xml:space="preserve"> </w:t>
-      </w:r>
-      <w:r>
-        <w:rPr>
-          <w:lang w:val="en-US"/>
-        </w:rPr>
-        <w:t>https://github.com/Wadim02/exam-scheduler</w:t>
+        <w:t xml:space="preserve"> https://github.com/Wadim02/exam-scheduler</w:t>
       </w:r>
     </w:p>
     <w:p>
@@ -4402,6 +5283,119 @@
     </w:lvl>
   </w:abstractNum>
   <w:abstractNum w:abstractNumId="1" w15:restartNumberingAfterBreak="0">
+    <w:nsid w:val="076F6D0C"/>
+    <w:multiLevelType w:val="hybridMultilevel"/>
+    <w:tmpl w:val="54DC04BE"/>
+    <w:lvl w:ilvl="0" w:tplc="04190001">
+      <w:start w:val="1"/>
+      <w:numFmt w:val="bullet"/>
+      <w:lvlText w:val=""/>
+      <w:lvlJc w:val="left"/>
+      <w:pPr>
+        <w:ind w:left="720" w:hanging="360"/>
+      </w:pPr>
+      <w:rPr>
+        <w:rFonts w:ascii="Symbol" w:hAnsi="Symbol" w:hint="default"/>
+      </w:rPr>
+    </w:lvl>
+    <w:lvl w:ilvl="1" w:tplc="04190003">
+      <w:start w:val="1"/>
+      <w:numFmt w:val="bullet"/>
+      <w:lvlText w:val="o"/>
+      <w:lvlJc w:val="left"/>
+      <w:pPr>
+        <w:ind w:left="1440" w:hanging="360"/>
+      </w:pPr>
+      <w:rPr>
+        <w:rFonts w:ascii="Courier New" w:hAnsi="Courier New" w:cs="Courier New" w:hint="default"/>
+      </w:rPr>
+    </w:lvl>
+    <w:lvl w:ilvl="2" w:tplc="04190005" w:tentative="1">
+      <w:start w:val="1"/>
+      <w:numFmt w:val="bullet"/>
+      <w:lvlText w:val=""/>
+      <w:lvlJc w:val="left"/>
+      <w:pPr>
+        <w:ind w:left="2160" w:hanging="360"/>
+      </w:pPr>
+      <w:rPr>
+        <w:rFonts w:ascii="Wingdings" w:hAnsi="Wingdings" w:hint="default"/>
+      </w:rPr>
+    </w:lvl>
+    <w:lvl w:ilvl="3" w:tplc="04190001" w:tentative="1">
+      <w:start w:val="1"/>
+      <w:numFmt w:val="bullet"/>
+      <w:lvlText w:val=""/>
+      <w:lvlJc w:val="left"/>
+      <w:pPr>
+        <w:ind w:left="2880" w:hanging="360"/>
+      </w:pPr>
+      <w:rPr>
+        <w:rFonts w:ascii="Symbol" w:hAnsi="Symbol" w:hint="default"/>
+      </w:rPr>
+    </w:lvl>
+    <w:lvl w:ilvl="4" w:tplc="04190003" w:tentative="1">
+      <w:start w:val="1"/>
+      <w:numFmt w:val="bullet"/>
+      <w:lvlText w:val="o"/>
+      <w:lvlJc w:val="left"/>
+      <w:pPr>
+        <w:ind w:left="3600" w:hanging="360"/>
+      </w:pPr>
+      <w:rPr>
+        <w:rFonts w:ascii="Courier New" w:hAnsi="Courier New" w:cs="Courier New" w:hint="default"/>
+      </w:rPr>
+    </w:lvl>
+    <w:lvl w:ilvl="5" w:tplc="04190005" w:tentative="1">
+      <w:start w:val="1"/>
+      <w:numFmt w:val="bullet"/>
+      <w:lvlText w:val=""/>
+      <w:lvlJc w:val="left"/>
+      <w:pPr>
+        <w:ind w:left="4320" w:hanging="360"/>
+      </w:pPr>
+      <w:rPr>
+        <w:rFonts w:ascii="Wingdings" w:hAnsi="Wingdings" w:hint="default"/>
+      </w:rPr>
+    </w:lvl>
+    <w:lvl w:ilvl="6" w:tplc="04190001" w:tentative="1">
+      <w:start w:val="1"/>
+      <w:numFmt w:val="bullet"/>
+      <w:lvlText w:val=""/>
+      <w:lvlJc w:val="left"/>
+      <w:pPr>
+        <w:ind w:left="5040" w:hanging="360"/>
+      </w:pPr>
+      <w:rPr>
+        <w:rFonts w:ascii="Symbol" w:hAnsi="Symbol" w:hint="default"/>
+      </w:rPr>
+    </w:lvl>
+    <w:lvl w:ilvl="7" w:tplc="04190003" w:tentative="1">
+      <w:start w:val="1"/>
+      <w:numFmt w:val="bullet"/>
+      <w:lvlText w:val="o"/>
+      <w:lvlJc w:val="left"/>
+      <w:pPr>
+        <w:ind w:left="5760" w:hanging="360"/>
+      </w:pPr>
+      <w:rPr>
+        <w:rFonts w:ascii="Courier New" w:hAnsi="Courier New" w:cs="Courier New" w:hint="default"/>
+      </w:rPr>
+    </w:lvl>
+    <w:lvl w:ilvl="8" w:tplc="04190005" w:tentative="1">
+      <w:start w:val="1"/>
+      <w:numFmt w:val="bullet"/>
+      <w:lvlText w:val=""/>
+      <w:lvlJc w:val="left"/>
+      <w:pPr>
+        <w:ind w:left="6480" w:hanging="360"/>
+      </w:pPr>
+      <w:rPr>
+        <w:rFonts w:ascii="Wingdings" w:hAnsi="Wingdings" w:hint="default"/>
+      </w:rPr>
+    </w:lvl>
+  </w:abstractNum>
+  <w:abstractNum w:abstractNumId="2" w15:restartNumberingAfterBreak="0">
     <w:nsid w:val="0E8D72C4"/>
     <w:multiLevelType w:val="hybridMultilevel"/>
     <w:tmpl w:val="11543E54"/>
@@ -4487,7 +5481,7 @@
       </w:pPr>
     </w:lvl>
   </w:abstractNum>
-  <w:abstractNum w:abstractNumId="2" w15:restartNumberingAfterBreak="0">
+  <w:abstractNum w:abstractNumId="3" w15:restartNumberingAfterBreak="0">
     <w:nsid w:val="10F248FB"/>
     <w:multiLevelType w:val="hybridMultilevel"/>
     <w:tmpl w:val="3676D714"/>
@@ -4576,7 +5570,7 @@
       </w:pPr>
     </w:lvl>
   </w:abstractNum>
-  <w:abstractNum w:abstractNumId="3" w15:restartNumberingAfterBreak="0">
+  <w:abstractNum w:abstractNumId="4" w15:restartNumberingAfterBreak="0">
     <w:nsid w:val="28783D7E"/>
     <w:multiLevelType w:val="hybridMultilevel"/>
     <w:tmpl w:val="8DFEE3E4"/>
@@ -4689,7 +5683,7 @@
       </w:rPr>
     </w:lvl>
   </w:abstractNum>
-  <w:abstractNum w:abstractNumId="4" w15:restartNumberingAfterBreak="0">
+  <w:abstractNum w:abstractNumId="5" w15:restartNumberingAfterBreak="0">
     <w:nsid w:val="371E3748"/>
     <w:multiLevelType w:val="hybridMultilevel"/>
     <w:tmpl w:val="16DA073C"/>
@@ -4802,10 +5796,10 @@
       </w:rPr>
     </w:lvl>
   </w:abstractNum>
-  <w:abstractNum w:abstractNumId="5" w15:restartNumberingAfterBreak="0">
+  <w:abstractNum w:abstractNumId="6" w15:restartNumberingAfterBreak="0">
     <w:nsid w:val="50644A63"/>
     <w:multiLevelType w:val="hybridMultilevel"/>
-    <w:tmpl w:val="04EAF35C"/>
+    <w:tmpl w:val="9ABA4758"/>
     <w:lvl w:ilvl="0" w:tplc="04190001">
       <w:start w:val="1"/>
       <w:numFmt w:val="bullet"/>
@@ -4915,7 +5909,7 @@
       </w:rPr>
     </w:lvl>
   </w:abstractNum>
-  <w:abstractNum w:abstractNumId="6" w15:restartNumberingAfterBreak="0">
+  <w:abstractNum w:abstractNumId="7" w15:restartNumberingAfterBreak="0">
     <w:nsid w:val="621D37EB"/>
     <w:multiLevelType w:val="hybridMultilevel"/>
     <w:tmpl w:val="2E421FDA"/>
@@ -5004,7 +5998,7 @@
       </w:pPr>
     </w:lvl>
   </w:abstractNum>
-  <w:abstractNum w:abstractNumId="7" w15:restartNumberingAfterBreak="0">
+  <w:abstractNum w:abstractNumId="8" w15:restartNumberingAfterBreak="0">
     <w:nsid w:val="658A1A47"/>
     <w:multiLevelType w:val="hybridMultilevel"/>
     <w:tmpl w:val="A65C8A2A"/>
@@ -5090,7 +6084,7 @@
       </w:pPr>
     </w:lvl>
   </w:abstractNum>
-  <w:abstractNum w:abstractNumId="8" w15:restartNumberingAfterBreak="0">
+  <w:abstractNum w:abstractNumId="9" w15:restartNumberingAfterBreak="0">
     <w:nsid w:val="6E1B6306"/>
     <w:multiLevelType w:val="hybridMultilevel"/>
     <w:tmpl w:val="2E107090"/>
@@ -5203,7 +6197,7 @@
       </w:rPr>
     </w:lvl>
   </w:abstractNum>
-  <w:abstractNum w:abstractNumId="9" w15:restartNumberingAfterBreak="0">
+  <w:abstractNum w:abstractNumId="10" w15:restartNumberingAfterBreak="0">
     <w:nsid w:val="6E382D20"/>
     <w:multiLevelType w:val="hybridMultilevel"/>
     <w:tmpl w:val="52BA2A84"/>
@@ -5316,7 +6310,7 @@
       </w:rPr>
     </w:lvl>
   </w:abstractNum>
-  <w:abstractNum w:abstractNumId="10" w15:restartNumberingAfterBreak="0">
+  <w:abstractNum w:abstractNumId="11" w15:restartNumberingAfterBreak="0">
     <w:nsid w:val="6F2361C3"/>
     <w:multiLevelType w:val="hybridMultilevel"/>
     <w:tmpl w:val="AE86D0AE"/>
@@ -5405,7 +6399,7 @@
       </w:pPr>
     </w:lvl>
   </w:abstractNum>
-  <w:abstractNum w:abstractNumId="11" w15:restartNumberingAfterBreak="0">
+  <w:abstractNum w:abstractNumId="12" w15:restartNumberingAfterBreak="0">
     <w:nsid w:val="74802DDA"/>
     <w:multiLevelType w:val="hybridMultilevel"/>
     <w:tmpl w:val="EFDEBCE6"/>
@@ -5495,40 +6489,43 @@
     </w:lvl>
   </w:abstractNum>
   <w:num w:numId="1" w16cid:durableId="912474438">
-    <w:abstractNumId w:val="8"/>
+    <w:abstractNumId w:val="9"/>
   </w:num>
   <w:num w:numId="2" w16cid:durableId="511067980">
-    <w:abstractNumId w:val="11"/>
+    <w:abstractNumId w:val="12"/>
   </w:num>
   <w:num w:numId="3" w16cid:durableId="1796823496">
-    <w:abstractNumId w:val="2"/>
+    <w:abstractNumId w:val="3"/>
   </w:num>
   <w:num w:numId="4" w16cid:durableId="135729851">
+    <w:abstractNumId w:val="5"/>
+  </w:num>
+  <w:num w:numId="5" w16cid:durableId="779184599">
     <w:abstractNumId w:val="4"/>
   </w:num>
-  <w:num w:numId="5" w16cid:durableId="779184599">
-    <w:abstractNumId w:val="3"/>
-  </w:num>
   <w:num w:numId="6" w16cid:durableId="1939828473">
-    <w:abstractNumId w:val="1"/>
+    <w:abstractNumId w:val="2"/>
   </w:num>
   <w:num w:numId="7" w16cid:durableId="607153719">
     <w:abstractNumId w:val="0"/>
   </w:num>
   <w:num w:numId="8" w16cid:durableId="1338852465">
+    <w:abstractNumId w:val="8"/>
+  </w:num>
+  <w:num w:numId="9" w16cid:durableId="2040817403">
+    <w:abstractNumId w:val="10"/>
+  </w:num>
+  <w:num w:numId="10" w16cid:durableId="1167330119">
+    <w:abstractNumId w:val="11"/>
+  </w:num>
+  <w:num w:numId="11" w16cid:durableId="2144232504">
     <w:abstractNumId w:val="7"/>
   </w:num>
-  <w:num w:numId="9" w16cid:durableId="2040817403">
-    <w:abstractNumId w:val="9"/>
-  </w:num>
-  <w:num w:numId="10" w16cid:durableId="1167330119">
-    <w:abstractNumId w:val="10"/>
-  </w:num>
-  <w:num w:numId="11" w16cid:durableId="2144232504">
+  <w:num w:numId="12" w16cid:durableId="853424944">
     <w:abstractNumId w:val="6"/>
   </w:num>
-  <w:num w:numId="12" w16cid:durableId="853424944">
-    <w:abstractNumId w:val="5"/>
+  <w:num w:numId="13" w16cid:durableId="1195267417">
+    <w:abstractNumId w:val="1"/>
   </w:num>
 </w:numbering>
 </file>

</xml_diff>